<commit_message>
feat: expand C197 Microsoft 365 masterclass courseware
</commit_message>
<xml_diff>
--- a/courseware/LP-Claude Microsoft 365 Masterclass (C197).docx
+++ b/courseware/LP-Claude Microsoft 365 Masterclass (C197).docx
@@ -179,7 +179,7 @@
           <w:color w:val="1F6FEB"/>
           <w:sz w:val="24"/>
         </w:rPr>
-        <w:t>Version 1.0</w:t>
+        <w:t>Version 2.0</w:t>
       </w:r>
     </w:p>
     <w:p>
@@ -322,7 +322,123 @@
               <w:rPr>
                 <w:sz w:val="19"/>
               </w:rPr>
-              <w:t>Initial release — C197 Claude Microsoft 365 Masterclass courseware.</w:t>
+              <w:t>Initial release.</w:t>
+            </w:r>
+          </w:p>
+        </w:tc>
+        <w:tc>
+          <w:tcPr>
+            <w:tcW w:type="dxa" w:w="2160"/>
+          </w:tcPr>
+          <w:p>
+            <w:r/>
+            <w:r>
+              <w:rPr>
+                <w:sz w:val="19"/>
+              </w:rPr>
+              <w:t>Jim Gan Chiu Liang (JL)</w:t>
+            </w:r>
+          </w:p>
+        </w:tc>
+      </w:tr>
+      <w:tr>
+        <w:tc>
+          <w:tcPr>
+            <w:tcW w:type="dxa" w:w="2160"/>
+          </w:tcPr>
+          <w:p>
+            <w:r/>
+            <w:r>
+              <w:rPr>
+                <w:sz w:val="19"/>
+              </w:rPr>
+              <w:t>1.1</w:t>
+            </w:r>
+          </w:p>
+        </w:tc>
+        <w:tc>
+          <w:tcPr>
+            <w:tcW w:type="dxa" w:w="2160"/>
+          </w:tcPr>
+          <w:p>
+            <w:r/>
+            <w:r>
+              <w:rPr>
+                <w:sz w:val="19"/>
+              </w:rPr>
+              <w:t>12 August 2026</w:t>
+            </w:r>
+          </w:p>
+        </w:tc>
+        <w:tc>
+          <w:tcPr>
+            <w:tcW w:type="dxa" w:w="2160"/>
+          </w:tcPr>
+          <w:p>
+            <w:r/>
+            <w:r>
+              <w:rPr>
+                <w:sz w:val="19"/>
+              </w:rPr>
+              <w:t>Visual redesign with current Office add-ins and connected review-pack labs.</w:t>
+            </w:r>
+          </w:p>
+        </w:tc>
+        <w:tc>
+          <w:tcPr>
+            <w:tcW w:type="dxa" w:w="2160"/>
+          </w:tcPr>
+          <w:p>
+            <w:r/>
+            <w:r>
+              <w:rPr>
+                <w:sz w:val="19"/>
+              </w:rPr>
+              <w:t>Jim Gan Chiu Liang (JL)</w:t>
+            </w:r>
+          </w:p>
+        </w:tc>
+      </w:tr>
+      <w:tr>
+        <w:tc>
+          <w:tcPr>
+            <w:tcW w:type="dxa" w:w="2160"/>
+          </w:tcPr>
+          <w:p>
+            <w:r/>
+            <w:r>
+              <w:rPr>
+                <w:sz w:val="19"/>
+              </w:rPr>
+              <w:t>2.0</w:t>
+            </w:r>
+          </w:p>
+        </w:tc>
+        <w:tc>
+          <w:tcPr>
+            <w:tcW w:type="dxa" w:w="2160"/>
+          </w:tcPr>
+          <w:p>
+            <w:r/>
+            <w:r>
+              <w:rPr>
+                <w:sz w:val="19"/>
+              </w:rPr>
+              <w:t>12 August 2026</w:t>
+            </w:r>
+          </w:p>
+        </w:tc>
+        <w:tc>
+          <w:tcPr>
+            <w:tcW w:type="dxa" w:w="2160"/>
+          </w:tcPr>
+          <w:p>
+            <w:r/>
+            <w:r>
+              <w:rPr>
+                <w:sz w:val="19"/>
+              </w:rPr>
+              <w:t>Expanded single-company curriculum; individual lab folders with realistic Office artifacts; planning, sustainability, HR, finance, Outlook, Cowork and Claude Code workflows.</w:t>
             </w:r>
           </w:p>
         </w:tc>
@@ -433,7 +549,7 @@
         </w:rPr>
         <w:t>Course Schedule</w:t>
         <w:tab/>
-        <w:t>4</w:t>
+        <w:t>5</w:t>
       </w:r>
     </w:p>
     <w:p>
@@ -451,9 +567,9 @@
           <w:color w:val="333333"/>
           <w:sz w:val="21"/>
         </w:rPr>
-        <w:t>Day 1 — Getting set up with Claude for Microsoft 365, then boosting productivity across Word, Excel, PowerPoint, Outlook and Teams</w:t>
+        <w:t>Day 1 — From governed Claude setup to a connected Lumina Living planning, analysis and automation workflow</w:t>
         <w:tab/>
-        <w:t>4</w:t>
+        <w:t>5</w:t>
       </w:r>
     </w:p>
     <w:p>
@@ -472,7 +588,7 @@
         </w:rPr>
         <w:t>Lab Reference (aligned to course topics)</w:t>
         <w:tab/>
-        <w:t>5</w:t>
+        <w:t>6</w:t>
       </w:r>
     </w:p>
     <w:p>
@@ -685,7 +801,7 @@
               <w:rPr>
                 <w:sz w:val="20"/>
               </w:rPr>
-              <w:t>Instructor-led, hands-on practical labs</w:t>
+              <w:t>Instructor-led, company-scenario workshops and hands-on practical labs</w:t>
             </w:r>
           </w:p>
         </w:tc>
@@ -744,7 +860,7 @@
         <w:rPr>
           <w:sz w:val="21"/>
         </w:rPr>
-        <w:t>LO1: Explain what Claude is and how it works alongside Microsoft 365, and set up Claude ready for work.</w:t>
+        <w:t>LO1: Select the right Claude and Microsoft 365 operating surface for a governed company task.</w:t>
       </w:r>
     </w:p>
     <w:p>
@@ -755,7 +871,7 @@
         <w:rPr>
           <w:sz w:val="21"/>
         </w:rPr>
-        <w:t>LO2: Connect Claude to your Microsoft 365 files and apps by uploading, pasting and using Projects and connectors.</w:t>
+        <w:t>LO2: Connect approved Microsoft 365 context and map permissions, sources and evidence boundaries.</w:t>
       </w:r>
     </w:p>
     <w:p>
@@ -766,7 +882,7 @@
         <w:rPr>
           <w:sz w:val="21"/>
         </w:rPr>
-        <w:t>LO3: Write clear, effective prompts that get accurate, usable results for everyday work tasks.</w:t>
+        <w:t>LO3: Direct Claude with an auditable prompt contract and a human approval gate.</w:t>
       </w:r>
     </w:p>
     <w:p>
@@ -777,7 +893,7 @@
         <w:rPr>
           <w:sz w:val="21"/>
         </w:rPr>
-        <w:t>LO4: Apply AI responsibly, securely and privately — knowing what to share, what to withhold and what to verify.</w:t>
+        <w:t>LO4: Produce a decision-ready marketing plan in Word from approved company evidence.</w:t>
       </w:r>
     </w:p>
     <w:p>
@@ -788,7 +904,7 @@
         <w:rPr>
           <w:sz w:val="21"/>
         </w:rPr>
-        <w:t>LO5: Use Claude to write, rewrite and summarise documents in Microsoft Word.</w:t>
+        <w:t>LO5: Develop an aligned strategic plan with choices, initiatives, owners, measures and risks.</w:t>
       </w:r>
     </w:p>
     <w:p>
@@ -799,7 +915,7 @@
         <w:rPr>
           <w:sz w:val="21"/>
         </w:rPr>
-        <w:t>LO6: Use Claude to analyse and explain data, and to build formulas, for Microsoft Excel.</w:t>
+        <w:t>LO6: Draft a sustainability report section and HR policy using source, legal and management review controls.</w:t>
       </w:r>
     </w:p>
     <w:p>
@@ -810,7 +926,7 @@
         <w:rPr>
           <w:sz w:val="21"/>
         </w:rPr>
-        <w:t>LO7: Use Claude to generate slide outlines and content for Microsoft PowerPoint.</w:t>
+        <w:t>LO7: Build a formula-driven financial analysis and executive dashboard in Excel.</w:t>
       </w:r>
     </w:p>
     <w:p>
@@ -821,7 +937,40 @@
         <w:rPr>
           <w:sz w:val="21"/>
         </w:rPr>
-        <w:t>LO8: Use Claude to draft and reply to messages in Microsoft Outlook and Teams.</w:t>
+        <w:t>LO8: Create a highly visual strategic and marketing PowerPoint with native Excel charts and evidence traceability.</w:t>
+      </w:r>
+    </w:p>
+    <w:p>
+      <w:pPr>
+        <w:pStyle w:val="ListBullet"/>
+      </w:pPr>
+      <w:r>
+        <w:rPr>
+          <w:sz w:val="21"/>
+        </w:rPr>
+        <w:t>LO9: Triage Outlook messages and prepare approval-based replies without bypassing the human send gate.</w:t>
+      </w:r>
+    </w:p>
+    <w:p>
+      <w:pPr>
+        <w:pStyle w:val="ListBullet"/>
+      </w:pPr>
+      <w:r>
+        <w:rPr>
+          <w:sz w:val="21"/>
+        </w:rPr>
+        <w:t>LO10: Use Claude Cowork with Microsoft 365 context to coordinate a multi-file planning workflow.</w:t>
+      </w:r>
+    </w:p>
+    <w:p>
+      <w:pPr>
+        <w:pStyle w:val="ListBullet"/>
+      </w:pPr>
+      <w:r>
+        <w:rPr>
+          <w:sz w:val="21"/>
+        </w:rPr>
+        <w:t>LO11: Use Claude Code and approved connectors to update Excel, search Outlook and produce a daily management brief.</w:t>
       </w:r>
     </w:p>
     <w:p>
@@ -889,7 +1038,7 @@
         <w:pStyle w:val="Heading2"/>
       </w:pPr>
       <w:r>
-        <w:t>Day 1 — Getting set up with Claude for Microsoft 365, then boosting productivity across Word, Excel, PowerPoint, Outlook and Teams</w:t>
+        <w:t>Day 1 — From governed Claude setup to a connected Lumina Living planning, analysis and automation workflow</w:t>
       </w:r>
     </w:p>
     <w:tbl>
@@ -974,7 +1123,7 @@
                 <w:b w:val="0"/>
                 <w:sz w:val="19"/>
               </w:rPr>
-              <w:t>9:30–9:50</w:t>
+              <w:t>9:30–9:45</w:t>
             </w:r>
           </w:p>
         </w:tc>
@@ -991,7 +1140,7 @@
                 <w:b w:val="0"/>
                 <w:sz w:val="19"/>
               </w:rPr>
-              <w:t>20 min</w:t>
+              <w:t>15 min</w:t>
             </w:r>
           </w:p>
         </w:tc>
@@ -1008,7 +1157,7 @@
                 <w:b w:val="0"/>
                 <w:sz w:val="19"/>
               </w:rPr>
-              <w:t>Welcome, course introduction, ground rules, and confirming Claude and Microsoft 365 access for the labs</w:t>
+              <w:t>Welcome, course orientation, company scenario and environment readiness</w:t>
             </w:r>
           </w:p>
         </w:tc>
@@ -1027,7 +1176,7 @@
                 <w:b/>
                 <w:sz w:val="19"/>
               </w:rPr>
-              <w:t>9:50–10:45</w:t>
+              <w:t>9:45–10:10</w:t>
             </w:r>
           </w:p>
         </w:tc>
@@ -1044,7 +1193,7 @@
                 <w:b w:val="0"/>
                 <w:sz w:val="19"/>
               </w:rPr>
-              <w:t>55 min</w:t>
+              <w:t>25 min</w:t>
             </w:r>
           </w:p>
         </w:tc>
@@ -1061,7 +1210,7 @@
                 <w:b/>
                 <w:sz w:val="19"/>
               </w:rPr>
-              <w:t>TOPIC 01 — Getting Started with Claude for Microsoft 365: what Claude is and how it works alongside Office; connecting Claude to your files and apps; effective prompting for work tasks; responsible, secure and private use of AI (concepts + live demo)</w:t>
+              <w:t>TOPIC 01 — Governed Foundations for Claude and Microsoft 365</w:t>
             </w:r>
           </w:p>
         </w:tc>
@@ -1079,7 +1228,7 @@
                 <w:b w:val="0"/>
                 <w:sz w:val="19"/>
               </w:rPr>
-              <w:t>10:45–11:30</w:t>
+              <w:t>10:10–11:15</w:t>
             </w:r>
           </w:p>
         </w:tc>
@@ -1095,7 +1244,7 @@
                 <w:b w:val="0"/>
                 <w:sz w:val="19"/>
               </w:rPr>
-              <w:t>45 min</w:t>
+              <w:t>65 min</w:t>
             </w:r>
           </w:p>
         </w:tc>
@@ -1111,7 +1260,7 @@
                 <w:b w:val="0"/>
                 <w:sz w:val="19"/>
               </w:rPr>
-              <w:t>Hands-on: Lab 1: Get Started with Claude for Microsoft 365; Lab 2: Connect Claude to Your Microsoft 365 Files and Apps</w:t>
+              <w:t>Hands-on: Lab 1: Choose and Activate the Right Claude Surface; Lab 2: Connect Microsoft 365 Context and Map Permissions; Lab 3: Build an Auditable Prompt and Review Contract</w:t>
             </w:r>
           </w:p>
         </w:tc>
@@ -1130,7 +1279,7 @@
                 <w:b w:val="0"/>
                 <w:sz w:val="19"/>
               </w:rPr>
-              <w:t>11:30–11:45</w:t>
+              <w:t>11:15–11:30</w:t>
             </w:r>
           </w:p>
         </w:tc>
@@ -1173,6 +1322,24 @@
         <w:tc>
           <w:tcPr>
             <w:tcW w:type="dxa" w:w="1656"/>
+            <w:shd w:val="clear" w:color="auto" w:fill="E8F0FE"/>
+          </w:tcPr>
+          <w:p>
+            <w:r/>
+            <w:r>
+              <w:rPr>
+                <w:rFonts w:ascii="Arial" w:hAnsi="Arial"/>
+                <w:b/>
+                <w:sz w:val="19"/>
+              </w:rPr>
+              <w:t>11:30–11:55</w:t>
+            </w:r>
+          </w:p>
+        </w:tc>
+        <w:tc>
+          <w:tcPr>
+            <w:tcW w:type="dxa" w:w="1296"/>
+            <w:shd w:val="clear" w:color="auto" w:fill="E8F0FE"/>
           </w:tcPr>
           <w:p>
             <w:r/>
@@ -1182,7 +1349,42 @@
                 <w:b w:val="0"/>
                 <w:sz w:val="19"/>
               </w:rPr>
-              <w:t>11:45–13:00</w:t>
+              <w:t>25 min</w:t>
+            </w:r>
+          </w:p>
+        </w:tc>
+        <w:tc>
+          <w:tcPr>
+            <w:tcW w:type="dxa" w:w="6840"/>
+            <w:shd w:val="clear" w:color="auto" w:fill="E8F0FE"/>
+          </w:tcPr>
+          <w:p>
+            <w:r/>
+            <w:r>
+              <w:rPr>
+                <w:rFonts w:ascii="Arial" w:hAnsi="Arial"/>
+                <w:b/>
+                <w:sz w:val="19"/>
+              </w:rPr>
+              <w:t>TOPIC 02 — Company Planning, Reporting and Policy Work</w:t>
+            </w:r>
+          </w:p>
+        </w:tc>
+      </w:tr>
+      <w:tr>
+        <w:tc>
+          <w:tcPr>
+            <w:tcW w:type="dxa" w:w="1656"/>
+          </w:tcPr>
+          <w:p>
+            <w:r/>
+            <w:r>
+              <w:rPr>
+                <w:rFonts w:ascii="Arial" w:hAnsi="Arial"/>
+                <w:b w:val="0"/>
+                <w:sz w:val="19"/>
+              </w:rPr>
+              <w:t>11:55–13:10</w:t>
             </w:r>
           </w:p>
         </w:tc>
@@ -1214,7 +1416,7 @@
                 <w:b w:val="0"/>
                 <w:sz w:val="19"/>
               </w:rPr>
-              <w:t>Hands-on: Lab 3: Write Effective Prompts for Everyday Work Tasks; Lab 4: Use AI Responsibly, Securely and Privately at Work</w:t>
+              <w:t>Hands-on: Lab 4: Create a Company Marketing Plan in Word; Lab 5: Develop a Strategic Plan with Owners and Measures; Lab 6: Draft Sustainability Reporting and HR Policy</w:t>
             </w:r>
           </w:p>
         </w:tc>
@@ -1233,7 +1435,7 @@
                 <w:b w:val="0"/>
                 <w:sz w:val="19"/>
               </w:rPr>
-              <w:t>13:00–14:00</w:t>
+              <w:t>13:10–14:10</w:t>
             </w:r>
           </w:p>
         </w:tc>
@@ -1286,7 +1488,7 @@
                 <w:b/>
                 <w:sz w:val="19"/>
               </w:rPr>
-              <w:t>14:00–14:50</w:t>
+              <w:t>14:10–14:35</w:t>
             </w:r>
           </w:p>
         </w:tc>
@@ -1303,7 +1505,7 @@
                 <w:b w:val="0"/>
                 <w:sz w:val="19"/>
               </w:rPr>
-              <w:t>50 min</w:t>
+              <w:t>25 min</w:t>
             </w:r>
           </w:p>
         </w:tc>
@@ -1320,7 +1522,7 @@
                 <w:b/>
                 <w:sz w:val="19"/>
               </w:rPr>
-              <w:t>TOPIC 02 — Boosting Productivity Across Microsoft 365 with Claude: writing, rewriting and summarising in Word; analysing and explaining data in Excel; generating slide content for PowerPoint; drafting and replying to email in Outlook and Teams (concepts + live demo)</w:t>
+              <w:t>TOPIC 03 — Financial Analysis and Executive Storytelling</w:t>
             </w:r>
           </w:p>
         </w:tc>
@@ -1338,7 +1540,7 @@
                 <w:b w:val="0"/>
                 <w:sz w:val="19"/>
               </w:rPr>
-              <w:t>14:50–15:30</w:t>
+              <w:t>14:35–15:25</w:t>
             </w:r>
           </w:p>
         </w:tc>
@@ -1354,7 +1556,7 @@
                 <w:b w:val="0"/>
                 <w:sz w:val="19"/>
               </w:rPr>
-              <w:t>40 min</w:t>
+              <w:t>50 min</w:t>
             </w:r>
           </w:p>
         </w:tc>
@@ -1370,7 +1572,7 @@
                 <w:b w:val="0"/>
                 <w:sz w:val="19"/>
               </w:rPr>
-              <w:t>Hands-on: Lab 5: Write, Rewrite and Summarise in Word</w:t>
+              <w:t>Hands-on: Lab 7: Build Financial Analysis and an Excel Dashboard</w:t>
             </w:r>
           </w:p>
         </w:tc>
@@ -1389,7 +1591,7 @@
                 <w:b w:val="0"/>
                 <w:sz w:val="19"/>
               </w:rPr>
-              <w:t>15:30–15:45</w:t>
+              <w:t>15:25–15:40</w:t>
             </w:r>
           </w:p>
         </w:tc>
@@ -1441,7 +1643,7 @@
                 <w:b w:val="0"/>
                 <w:sz w:val="19"/>
               </w:rPr>
-              <w:t>15:45–18:15</w:t>
+              <w:t>15:40–16:20</w:t>
             </w:r>
           </w:p>
         </w:tc>
@@ -1457,7 +1659,7 @@
                 <w:b w:val="0"/>
                 <w:sz w:val="19"/>
               </w:rPr>
-              <w:t>150 min</w:t>
+              <w:t>40 min</w:t>
             </w:r>
           </w:p>
         </w:tc>
@@ -1473,7 +1675,210 @@
                 <w:b w:val="0"/>
                 <w:sz w:val="19"/>
               </w:rPr>
-              <w:t>Hands-on: Lab 6: Analyse and Explain Data in Excel; Lab 7: Generate Slide Outlines and Content for PowerPoint; Lab 8: Draft and Reply to Email in Outlook and Teams</w:t>
+              <w:t>Hands-on: Lab 8: Create an Executive Strategy and Marketing Deck</w:t>
+            </w:r>
+          </w:p>
+        </w:tc>
+      </w:tr>
+      <w:tr>
+        <w:tc>
+          <w:tcPr>
+            <w:tcW w:type="dxa" w:w="1656"/>
+            <w:shd w:val="clear" w:color="auto" w:fill="E8F0FE"/>
+          </w:tcPr>
+          <w:p>
+            <w:r/>
+            <w:r>
+              <w:rPr>
+                <w:rFonts w:ascii="Arial" w:hAnsi="Arial"/>
+                <w:b/>
+                <w:sz w:val="19"/>
+              </w:rPr>
+              <w:t>16:20–16:40</w:t>
+            </w:r>
+          </w:p>
+        </w:tc>
+        <w:tc>
+          <w:tcPr>
+            <w:tcW w:type="dxa" w:w="1296"/>
+            <w:shd w:val="clear" w:color="auto" w:fill="E8F0FE"/>
+          </w:tcPr>
+          <w:p>
+            <w:r/>
+            <w:r>
+              <w:rPr>
+                <w:rFonts w:ascii="Arial" w:hAnsi="Arial"/>
+                <w:b w:val="0"/>
+                <w:sz w:val="19"/>
+              </w:rPr>
+              <w:t>20 min</w:t>
+            </w:r>
+          </w:p>
+        </w:tc>
+        <w:tc>
+          <w:tcPr>
+            <w:tcW w:type="dxa" w:w="6840"/>
+            <w:shd w:val="clear" w:color="auto" w:fill="E8F0FE"/>
+          </w:tcPr>
+          <w:p>
+            <w:r/>
+            <w:r>
+              <w:rPr>
+                <w:rFonts w:ascii="Arial" w:hAnsi="Arial"/>
+                <w:b/>
+                <w:sz w:val="19"/>
+              </w:rPr>
+              <w:t>TOPIC 04 — Agentic Coordination with Outlook, Cowork and Claude Code</w:t>
+            </w:r>
+          </w:p>
+        </w:tc>
+      </w:tr>
+      <w:tr>
+        <w:tc>
+          <w:tcPr>
+            <w:tcW w:type="dxa" w:w="1656"/>
+          </w:tcPr>
+          <w:p>
+            <w:r/>
+            <w:r>
+              <w:rPr>
+                <w:rFonts w:ascii="Arial" w:hAnsi="Arial"/>
+                <w:b w:val="0"/>
+                <w:sz w:val="19"/>
+              </w:rPr>
+              <w:t>16:40–17:10</w:t>
+            </w:r>
+          </w:p>
+        </w:tc>
+        <w:tc>
+          <w:tcPr>
+            <w:tcW w:type="dxa" w:w="1296"/>
+          </w:tcPr>
+          <w:p>
+            <w:r/>
+            <w:r>
+              <w:rPr>
+                <w:rFonts w:ascii="Arial" w:hAnsi="Arial"/>
+                <w:b w:val="0"/>
+                <w:sz w:val="19"/>
+              </w:rPr>
+              <w:t>30 min</w:t>
+            </w:r>
+          </w:p>
+        </w:tc>
+        <w:tc>
+          <w:tcPr>
+            <w:tcW w:type="dxa" w:w="6840"/>
+          </w:tcPr>
+          <w:p>
+            <w:r/>
+            <w:r>
+              <w:rPr>
+                <w:rFonts w:ascii="Arial" w:hAnsi="Arial"/>
+                <w:b w:val="0"/>
+                <w:sz w:val="19"/>
+              </w:rPr>
+              <w:t>Hands-on: Lab 9: Triage and Prepare Approved Outlook Replies</w:t>
+            </w:r>
+          </w:p>
+        </w:tc>
+      </w:tr>
+      <w:tr>
+        <w:tc>
+          <w:tcPr>
+            <w:tcW w:type="dxa" w:w="1656"/>
+          </w:tcPr>
+          <w:p>
+            <w:r/>
+            <w:r>
+              <w:rPr>
+                <w:rFonts w:ascii="Arial" w:hAnsi="Arial"/>
+                <w:b w:val="0"/>
+                <w:sz w:val="19"/>
+              </w:rPr>
+              <w:t>17:10–17:45</w:t>
+            </w:r>
+          </w:p>
+        </w:tc>
+        <w:tc>
+          <w:tcPr>
+            <w:tcW w:type="dxa" w:w="1296"/>
+          </w:tcPr>
+          <w:p>
+            <w:r/>
+            <w:r>
+              <w:rPr>
+                <w:rFonts w:ascii="Arial" w:hAnsi="Arial"/>
+                <w:b w:val="0"/>
+                <w:sz w:val="19"/>
+              </w:rPr>
+              <w:t>35 min</w:t>
+            </w:r>
+          </w:p>
+        </w:tc>
+        <w:tc>
+          <w:tcPr>
+            <w:tcW w:type="dxa" w:w="6840"/>
+          </w:tcPr>
+          <w:p>
+            <w:r/>
+            <w:r>
+              <w:rPr>
+                <w:rFonts w:ascii="Arial" w:hAnsi="Arial"/>
+                <w:b w:val="0"/>
+                <w:sz w:val="19"/>
+              </w:rPr>
+              <w:t>Hands-on: Lab 10: Coordinate the Planning Pack with Claude Cowork</w:t>
+            </w:r>
+          </w:p>
+        </w:tc>
+      </w:tr>
+      <w:tr>
+        <w:tc>
+          <w:tcPr>
+            <w:tcW w:type="dxa" w:w="1656"/>
+          </w:tcPr>
+          <w:p>
+            <w:r/>
+            <w:r>
+              <w:rPr>
+                <w:rFonts w:ascii="Arial" w:hAnsi="Arial"/>
+                <w:b w:val="0"/>
+                <w:sz w:val="19"/>
+              </w:rPr>
+              <w:t>17:45–18:15</w:t>
+            </w:r>
+          </w:p>
+        </w:tc>
+        <w:tc>
+          <w:tcPr>
+            <w:tcW w:type="dxa" w:w="1296"/>
+          </w:tcPr>
+          <w:p>
+            <w:r/>
+            <w:r>
+              <w:rPr>
+                <w:rFonts w:ascii="Arial" w:hAnsi="Arial"/>
+                <w:b w:val="0"/>
+                <w:sz w:val="19"/>
+              </w:rPr>
+              <w:t>30 min</w:t>
+            </w:r>
+          </w:p>
+        </w:tc>
+        <w:tc>
+          <w:tcPr>
+            <w:tcW w:type="dxa" w:w="6840"/>
+          </w:tcPr>
+          <w:p>
+            <w:r/>
+            <w:r>
+              <w:rPr>
+                <w:rFonts w:ascii="Arial" w:hAnsi="Arial"/>
+                <w:b w:val="0"/>
+                <w:sz w:val="19"/>
+              </w:rPr>
+              <w:t>Hands-on: Lab 11: Automate Excel, Outlook and a Daily Brief with Claude Code</w:t>
             </w:r>
           </w:p>
         </w:tc>
@@ -1526,7 +1931,7 @@
                 <w:b w:val="0"/>
                 <w:sz w:val="19"/>
               </w:rPr>
-              <w:t>Course wrap-up, your Claude-for-Microsoft-365 workflow and next steps</w:t>
+              <w:t>Integrated workflow review, transfer to work and next steps</w:t>
             </w:r>
           </w:p>
         </w:tc>
@@ -1631,7 +2036,7 @@
                 <w:b/>
                 <w:sz w:val="19"/>
               </w:rPr>
-              <w:t>Topic 01: Getting Started with Claude for Microsoft 365</w:t>
+              <w:t>Topic 01: Governed Foundations for Claude and Microsoft 365</w:t>
             </w:r>
           </w:p>
         </w:tc>
@@ -1648,7 +2053,7 @@
                 <w:b w:val="0"/>
                 <w:sz w:val="19"/>
               </w:rPr>
-              <w:t>50%</w:t>
+              <w:t>24%</w:t>
             </w:r>
           </w:p>
         </w:tc>
@@ -1664,7 +2069,7 @@
                 <w:b w:val="0"/>
                 <w:sz w:val="19"/>
               </w:rPr>
-              <w:t>Lab 1, Lab 2, Lab 3, Lab 4</w:t>
+              <w:t>Lab 1, Lab 2, Lab 3</w:t>
             </w:r>
           </w:p>
         </w:tc>
@@ -1683,7 +2088,7 @@
                 <w:b/>
                 <w:sz w:val="19"/>
               </w:rPr>
-              <w:t>Topic 02: Boosting Productivity Across Microsoft 365 with Claude</w:t>
+              <w:t>Topic 02: Company Planning, Reporting and Policy Work</w:t>
             </w:r>
           </w:p>
         </w:tc>
@@ -1700,7 +2105,7 @@
                 <w:b w:val="0"/>
                 <w:sz w:val="19"/>
               </w:rPr>
-              <w:t>50%</w:t>
+              <w:t>28%</w:t>
             </w:r>
           </w:p>
         </w:tc>
@@ -1716,7 +2121,111 @@
                 <w:b w:val="0"/>
                 <w:sz w:val="19"/>
               </w:rPr>
-              <w:t>Lab 5, Lab 6, Lab 7, Lab 8</w:t>
+              <w:t>Lab 4, Lab 5, Lab 6</w:t>
+            </w:r>
+          </w:p>
+        </w:tc>
+      </w:tr>
+      <w:tr>
+        <w:tc>
+          <w:tcPr>
+            <w:tcW w:type="dxa" w:w="2880"/>
+            <w:shd w:val="clear" w:color="auto" w:fill="E8F0FE"/>
+          </w:tcPr>
+          <w:p>
+            <w:r/>
+            <w:r>
+              <w:rPr>
+                <w:rFonts w:ascii="Arial" w:hAnsi="Arial"/>
+                <w:b/>
+                <w:sz w:val="19"/>
+              </w:rPr>
+              <w:t>Topic 03: Financial Analysis and Executive Storytelling</w:t>
+            </w:r>
+          </w:p>
+        </w:tc>
+        <w:tc>
+          <w:tcPr>
+            <w:tcW w:type="dxa" w:w="2880"/>
+            <w:shd w:val="clear" w:color="auto" w:fill="E8F0FE"/>
+          </w:tcPr>
+          <w:p>
+            <w:r/>
+            <w:r>
+              <w:rPr>
+                <w:rFonts w:ascii="Arial" w:hAnsi="Arial"/>
+                <w:b w:val="0"/>
+                <w:sz w:val="19"/>
+              </w:rPr>
+              <w:t>25%</w:t>
+            </w:r>
+          </w:p>
+        </w:tc>
+        <w:tc>
+          <w:tcPr>
+            <w:tcW w:type="dxa" w:w="2880"/>
+          </w:tcPr>
+          <w:p>
+            <w:r/>
+            <w:r>
+              <w:rPr>
+                <w:rFonts w:ascii="Arial" w:hAnsi="Arial"/>
+                <w:b w:val="0"/>
+                <w:sz w:val="19"/>
+              </w:rPr>
+              <w:t>Lab 7, Lab 8</w:t>
+            </w:r>
+          </w:p>
+        </w:tc>
+      </w:tr>
+      <w:tr>
+        <w:tc>
+          <w:tcPr>
+            <w:tcW w:type="dxa" w:w="2880"/>
+            <w:shd w:val="clear" w:color="auto" w:fill="E8F0FE"/>
+          </w:tcPr>
+          <w:p>
+            <w:r/>
+            <w:r>
+              <w:rPr>
+                <w:rFonts w:ascii="Arial" w:hAnsi="Arial"/>
+                <w:b/>
+                <w:sz w:val="19"/>
+              </w:rPr>
+              <w:t>Topic 04: Agentic Coordination with Outlook, Cowork and Claude Code</w:t>
+            </w:r>
+          </w:p>
+        </w:tc>
+        <w:tc>
+          <w:tcPr>
+            <w:tcW w:type="dxa" w:w="2880"/>
+            <w:shd w:val="clear" w:color="auto" w:fill="E8F0FE"/>
+          </w:tcPr>
+          <w:p>
+            <w:r/>
+            <w:r>
+              <w:rPr>
+                <w:rFonts w:ascii="Arial" w:hAnsi="Arial"/>
+                <w:b w:val="0"/>
+                <w:sz w:val="19"/>
+              </w:rPr>
+              <w:t>23%</w:t>
+            </w:r>
+          </w:p>
+        </w:tc>
+        <w:tc>
+          <w:tcPr>
+            <w:tcW w:type="dxa" w:w="2880"/>
+          </w:tcPr>
+          <w:p>
+            <w:r/>
+            <w:r>
+              <w:rPr>
+                <w:rFonts w:ascii="Arial" w:hAnsi="Arial"/>
+                <w:b w:val="0"/>
+                <w:sz w:val="19"/>
+              </w:rPr>
+              <w:t>Lab 9, Lab 10, Lab 11</w:t>
             </w:r>
           </w:p>
         </w:tc>

</xml_diff>